<commit_message>
Finalização da classe SegyTextHeader, teste de criacao do textheader, criação de algumas exceções, reestruturação dos pacotes, criação das primeiras classes abstratas
</commit_message>
<xml_diff>
--- a/docs/architecture/Estrutura de pastas do SEGY-PROJECT.docx
+++ b/docs/architecture/Estrutura de pastas do SEGY-PROJECT.docx
@@ -55,6 +55,7 @@
           <w:rFonts w:ascii="Consolas" w:hAnsi="Consolas"/>
           <w:sz w:val="16"/>
           <w:szCs w:val="16"/>
+          <w:highlight w:val="green"/>
         </w:rPr>
       </w:pPr>
       <w:r>
@@ -72,6 +73,7 @@
           <w:rFonts w:ascii="Consolas" w:hAnsi="Consolas"/>
           <w:sz w:val="16"/>
           <w:szCs w:val="16"/>
+          <w:highlight w:val="green"/>
         </w:rPr>
         <w:t>pyproject.toml</w:t>
       </w:r>
@@ -85,13 +87,15 @@
           <w:rFonts w:ascii="Consolas" w:hAnsi="Consolas"/>
           <w:sz w:val="16"/>
           <w:szCs w:val="16"/>
-        </w:rPr>
-      </w:pPr>
-      <w:r>
-        <w:rPr>
-          <w:rFonts w:ascii="Consolas" w:hAnsi="Consolas"/>
-          <w:sz w:val="16"/>
-          <w:szCs w:val="16"/>
+          <w:highlight w:val="green"/>
+        </w:rPr>
+      </w:pPr>
+      <w:r>
+        <w:rPr>
+          <w:rFonts w:ascii="Consolas" w:hAnsi="Consolas"/>
+          <w:sz w:val="16"/>
+          <w:szCs w:val="16"/>
+          <w:highlight w:val="green"/>
         </w:rPr>
         <w:t>├── README.md</w:t>
       </w:r>
@@ -103,13 +107,15 @@
           <w:rFonts w:ascii="Consolas" w:hAnsi="Consolas"/>
           <w:sz w:val="16"/>
           <w:szCs w:val="16"/>
-        </w:rPr>
-      </w:pPr>
-      <w:r>
-        <w:rPr>
-          <w:rFonts w:ascii="Consolas" w:hAnsi="Consolas"/>
-          <w:sz w:val="16"/>
-          <w:szCs w:val="16"/>
+          <w:highlight w:val="green"/>
+        </w:rPr>
+      </w:pPr>
+      <w:r>
+        <w:rPr>
+          <w:rFonts w:ascii="Consolas" w:hAnsi="Consolas"/>
+          <w:sz w:val="16"/>
+          <w:szCs w:val="16"/>
+          <w:highlight w:val="green"/>
         </w:rPr>
         <w:t>├── LICENSE</w:t>
       </w:r>
@@ -128,6 +134,7 @@
           <w:rFonts w:ascii="Consolas" w:hAnsi="Consolas"/>
           <w:sz w:val="16"/>
           <w:szCs w:val="16"/>
+          <w:highlight w:val="green"/>
         </w:rPr>
         <w:t>├─</w:t>
       </w:r>
@@ -137,6 +144,7 @@
           <w:rFonts w:ascii="Consolas" w:hAnsi="Consolas"/>
           <w:sz w:val="16"/>
           <w:szCs w:val="16"/>
+          <w:highlight w:val="green"/>
         </w:rPr>
         <w:t>─ .</w:t>
       </w:r>
@@ -146,6 +154,7 @@
           <w:rFonts w:ascii="Consolas" w:hAnsi="Consolas"/>
           <w:sz w:val="16"/>
           <w:szCs w:val="16"/>
+          <w:highlight w:val="green"/>
         </w:rPr>
         <w:t>gitignore</w:t>
       </w:r>
@@ -839,31 +848,74 @@
           <w:rFonts w:ascii="Consolas" w:hAnsi="Consolas"/>
           <w:sz w:val="16"/>
           <w:szCs w:val="16"/>
-        </w:rPr>
-      </w:pPr>
-      <w:r>
-        <w:rPr>
-          <w:rFonts w:ascii="Consolas" w:hAnsi="Consolas"/>
-          <w:sz w:val="16"/>
-          <w:szCs w:val="16"/>
-        </w:rPr>
-        <w:t>│       │   │   └── seismic_file.py        &lt;-- Classe abstrata (ABC)</w:t>
-      </w:r>
-    </w:p>
-    <w:p>
-      <w:pPr>
-        <w:spacing w:after="0" w:line="240" w:lineRule="auto"/>
-        <w:rPr>
-          <w:rFonts w:ascii="Consolas" w:hAnsi="Consolas"/>
-          <w:sz w:val="16"/>
-          <w:szCs w:val="16"/>
-        </w:rPr>
-      </w:pPr>
-      <w:r>
-        <w:rPr>
-          <w:rFonts w:ascii="Consolas" w:hAnsi="Consolas"/>
-          <w:sz w:val="16"/>
-          <w:szCs w:val="16"/>
+          <w:lang w:val="en-US"/>
+        </w:rPr>
+      </w:pPr>
+      <w:r>
+        <w:rPr>
+          <w:rFonts w:ascii="Consolas" w:hAnsi="Consolas"/>
+          <w:sz w:val="16"/>
+          <w:szCs w:val="16"/>
+          <w:lang w:val="en-US"/>
+        </w:rPr>
+        <w:t xml:space="preserve">│       │   │   └── </w:t>
+      </w:r>
+      <w:r>
+        <w:rPr>
+          <w:rFonts w:ascii="Consolas" w:hAnsi="Consolas"/>
+          <w:sz w:val="16"/>
+          <w:szCs w:val="16"/>
+          <w:highlight w:val="green"/>
+          <w:lang w:val="en-US"/>
+        </w:rPr>
+        <w:t>seismic_file.py</w:t>
+      </w:r>
+      <w:r>
+        <w:rPr>
+          <w:rFonts w:ascii="Consolas" w:hAnsi="Consolas"/>
+          <w:sz w:val="16"/>
+          <w:szCs w:val="16"/>
+          <w:lang w:val="en-US"/>
+        </w:rPr>
+        <w:t xml:space="preserve">        &lt;-- Classe </w:t>
+      </w:r>
+      <w:proofErr w:type="spellStart"/>
+      <w:r>
+        <w:rPr>
+          <w:rFonts w:ascii="Consolas" w:hAnsi="Consolas"/>
+          <w:sz w:val="16"/>
+          <w:szCs w:val="16"/>
+          <w:lang w:val="en-US"/>
+        </w:rPr>
+        <w:t>abstrata</w:t>
+      </w:r>
+      <w:proofErr w:type="spellEnd"/>
+      <w:r>
+        <w:rPr>
+          <w:rFonts w:ascii="Consolas" w:hAnsi="Consolas"/>
+          <w:sz w:val="16"/>
+          <w:szCs w:val="16"/>
+          <w:lang w:val="en-US"/>
+        </w:rPr>
+        <w:t xml:space="preserve"> (ABC)</w:t>
+      </w:r>
+    </w:p>
+    <w:p>
+      <w:pPr>
+        <w:spacing w:after="0" w:line="240" w:lineRule="auto"/>
+        <w:rPr>
+          <w:rFonts w:ascii="Consolas" w:hAnsi="Consolas"/>
+          <w:sz w:val="16"/>
+          <w:szCs w:val="16"/>
+          <w:lang w:val="en-US"/>
+        </w:rPr>
+      </w:pPr>
+      <w:r>
+        <w:rPr>
+          <w:rFonts w:ascii="Consolas" w:hAnsi="Consolas"/>
+          <w:sz w:val="16"/>
+          <w:szCs w:val="16"/>
+          <w:lang w:val="en-US"/>
         </w:rPr>
         <w:t>│       │   │</w:t>
       </w:r>
@@ -875,47 +927,33 @@
           <w:rFonts w:ascii="Consolas" w:hAnsi="Consolas"/>
           <w:sz w:val="16"/>
           <w:szCs w:val="16"/>
-        </w:rPr>
-      </w:pPr>
-      <w:r>
-        <w:rPr>
-          <w:rFonts w:ascii="Consolas" w:hAnsi="Consolas"/>
-          <w:sz w:val="16"/>
-          <w:szCs w:val="16"/>
-        </w:rPr>
-        <w:t xml:space="preserve">│       │   ├── </w:t>
-      </w:r>
-      <w:proofErr w:type="spellStart"/>
-      <w:r>
-        <w:rPr>
-          <w:rFonts w:ascii="Consolas" w:hAnsi="Consolas"/>
-          <w:sz w:val="16"/>
-          <w:szCs w:val="16"/>
-        </w:rPr>
-        <w:t>datasets</w:t>
-      </w:r>
-      <w:proofErr w:type="spellEnd"/>
-      <w:r>
-        <w:rPr>
-          <w:rFonts w:ascii="Consolas" w:hAnsi="Consolas"/>
-          <w:sz w:val="16"/>
-          <w:szCs w:val="16"/>
-        </w:rPr>
-        <w:t>/</w:t>
-      </w:r>
-    </w:p>
-    <w:p>
-      <w:pPr>
-        <w:spacing w:after="0" w:line="240" w:lineRule="auto"/>
-        <w:rPr>
-          <w:rFonts w:ascii="Consolas" w:hAnsi="Consolas"/>
-          <w:sz w:val="16"/>
-          <w:szCs w:val="16"/>
-        </w:rPr>
-      </w:pPr>
-      <w:r>
-        <w:rPr>
-          <w:rFonts w:ascii="Consolas" w:hAnsi="Consolas"/>
+          <w:lang w:val="en-US"/>
+        </w:rPr>
+      </w:pPr>
+      <w:r>
+        <w:rPr>
+          <w:rFonts w:ascii="Consolas" w:hAnsi="Consolas"/>
+          <w:sz w:val="16"/>
+          <w:szCs w:val="16"/>
+          <w:lang w:val="en-US"/>
+        </w:rPr>
+        <w:t>│       │   ├── datasets/</w:t>
+      </w:r>
+    </w:p>
+    <w:p>
+      <w:pPr>
+        <w:spacing w:after="0" w:line="240" w:lineRule="auto"/>
+        <w:rPr>
+          <w:rFonts w:ascii="Consolas" w:hAnsi="Consolas"/>
+          <w:sz w:val="16"/>
+          <w:szCs w:val="16"/>
+          <w:lang w:val="en-US"/>
+        </w:rPr>
+      </w:pPr>
+      <w:r>
+        <w:rPr>
+          <w:rFonts w:ascii="Consolas" w:hAnsi="Consolas"/>
+          <w:noProof/>
           <w:sz w:val="16"/>
           <w:szCs w:val="16"/>
           <w:lang w:val="en-US"/>
@@ -987,6 +1025,7 @@
           <w:rFonts w:ascii="Consolas" w:hAnsi="Consolas"/>
           <w:sz w:val="16"/>
           <w:szCs w:val="16"/>
+          <w:lang w:val="en-US"/>
         </w:rPr>
         <w:t>│       │   │   ├── __init__.py</w:t>
       </w:r>
@@ -998,13 +1037,15 @@
           <w:rFonts w:ascii="Consolas" w:hAnsi="Consolas"/>
           <w:sz w:val="16"/>
           <w:szCs w:val="16"/>
-        </w:rPr>
-      </w:pPr>
-      <w:r>
-        <w:rPr>
-          <w:rFonts w:ascii="Consolas" w:hAnsi="Consolas"/>
-          <w:sz w:val="16"/>
-          <w:szCs w:val="16"/>
+          <w:lang w:val="en-US"/>
+        </w:rPr>
+      </w:pPr>
+      <w:r>
+        <w:rPr>
+          <w:rFonts w:ascii="Consolas" w:hAnsi="Consolas"/>
+          <w:sz w:val="16"/>
+          <w:szCs w:val="16"/>
+          <w:lang w:val="en-US"/>
         </w:rPr>
         <w:t>│       │   │   ├── seismic_dataset.py</w:t>
       </w:r>
@@ -1342,6 +1383,73 @@
       <w:r>
         <w:rPr>
           <w:rFonts w:ascii="Consolas" w:hAnsi="Consolas"/>
+          <w:noProof/>
+          <w:sz w:val="16"/>
+          <w:szCs w:val="16"/>
+        </w:rPr>
+        <w:drawing>
+          <wp:anchor distT="0" distB="0" distL="114300" distR="114300" simplePos="0" relativeHeight="251661312" behindDoc="0" locked="0" layoutInCell="1" allowOverlap="1" wp14:anchorId="6CE8ED1B" wp14:editId="614DF742">
+            <wp:simplePos x="0" y="0"/>
+            <wp:positionH relativeFrom="column">
+              <wp:posOffset>4567555</wp:posOffset>
+            </wp:positionH>
+            <wp:positionV relativeFrom="paragraph">
+              <wp:posOffset>4445</wp:posOffset>
+            </wp:positionV>
+            <wp:extent cx="2219325" cy="1666875"/>
+            <wp:effectExtent l="0" t="0" r="9525" b="9525"/>
+            <wp:wrapNone/>
+            <wp:docPr id="848476607" name="Imagem 1"/>
+            <wp:cNvGraphicFramePr>
+              <a:graphicFrameLocks xmlns:a="http://schemas.openxmlformats.org/drawingml/2006/main" noChangeAspect="1"/>
+            </wp:cNvGraphicFramePr>
+            <a:graphic xmlns:a="http://schemas.openxmlformats.org/drawingml/2006/main">
+              <a:graphicData uri="http://schemas.openxmlformats.org/drawingml/2006/picture">
+                <pic:pic xmlns:pic="http://schemas.openxmlformats.org/drawingml/2006/picture">
+                  <pic:nvPicPr>
+                    <pic:cNvPr id="0" name="Picture 2"/>
+                    <pic:cNvPicPr>
+                      <a:picLocks noChangeAspect="1" noChangeArrowheads="1"/>
+                    </pic:cNvPicPr>
+                  </pic:nvPicPr>
+                  <pic:blipFill>
+                    <a:blip r:embed="rId7">
+                      <a:extLst>
+                        <a:ext uri="{28A0092B-C50C-407E-A947-70E740481C1C}">
+                          <a14:useLocalDpi xmlns:a14="http://schemas.microsoft.com/office/drawing/2010/main" val="0"/>
+                        </a:ext>
+                      </a:extLst>
+                    </a:blip>
+                    <a:srcRect/>
+                    <a:stretch>
+                      <a:fillRect/>
+                    </a:stretch>
+                  </pic:blipFill>
+                  <pic:spPr bwMode="auto">
+                    <a:xfrm>
+                      <a:off x="0" y="0"/>
+                      <a:ext cx="2219325" cy="1666875"/>
+                    </a:xfrm>
+                    <a:prstGeom prst="rect">
+                      <a:avLst/>
+                    </a:prstGeom>
+                    <a:noFill/>
+                  </pic:spPr>
+                </pic:pic>
+              </a:graphicData>
+            </a:graphic>
+            <wp14:sizeRelH relativeFrom="page">
+              <wp14:pctWidth>0</wp14:pctWidth>
+            </wp14:sizeRelH>
+            <wp14:sizeRelV relativeFrom="page">
+              <wp14:pctHeight>0</wp14:pctHeight>
+            </wp14:sizeRelV>
+          </wp:anchor>
+        </w:drawing>
+      </w:r>
+      <w:r>
+        <w:rPr>
+          <w:rFonts w:ascii="Consolas" w:hAnsi="Consolas"/>
           <w:sz w:val="16"/>
           <w:szCs w:val="16"/>
           <w:lang w:val="en-US"/>
@@ -1395,6 +1503,44 @@
           <w:szCs w:val="16"/>
           <w:lang w:val="en-US"/>
         </w:rPr>
+        <w:t xml:space="preserve"> ├──</w:t>
+      </w:r>
+      <w:r>
+        <w:rPr>
+          <w:rFonts w:ascii="Consolas" w:hAnsi="Consolas"/>
+          <w:sz w:val="16"/>
+          <w:szCs w:val="16"/>
+          <w:lang w:val="en-US"/>
+        </w:rPr>
+        <w:t xml:space="preserve"> byte_order.py</w:t>
+      </w:r>
+    </w:p>
+    <w:p>
+      <w:pPr>
+        <w:spacing w:after="0" w:line="240" w:lineRule="auto"/>
+        <w:rPr>
+          <w:rFonts w:ascii="Consolas" w:hAnsi="Consolas"/>
+          <w:sz w:val="16"/>
+          <w:szCs w:val="16"/>
+          <w:lang w:val="en-US"/>
+        </w:rPr>
+      </w:pPr>
+      <w:r>
+        <w:rPr>
+          <w:rFonts w:ascii="Consolas" w:hAnsi="Consolas"/>
+          <w:sz w:val="16"/>
+          <w:szCs w:val="16"/>
+          <w:lang w:val="en-US"/>
+        </w:rPr>
+        <w:t xml:space="preserve">│       │   │  </w:t>
+      </w:r>
+      <w:r>
+        <w:rPr>
+          <w:rFonts w:ascii="Consolas" w:hAnsi="Consolas"/>
+          <w:sz w:val="16"/>
+          <w:szCs w:val="16"/>
+          <w:lang w:val="en-US"/>
+        </w:rPr>
         <w:t xml:space="preserve"> ├── header_field.py          ← </w:t>
       </w:r>
       <w:proofErr w:type="spellStart"/>
@@ -1595,7 +1741,26 @@
           <w:szCs w:val="16"/>
           <w:lang w:val="en-US"/>
         </w:rPr>
-        <w:t xml:space="preserve"> ├── text_header.py           ← </w:t>
+        <w:t xml:space="preserve"> ├── </w:t>
+      </w:r>
+      <w:r>
+        <w:rPr>
+          <w:rFonts w:ascii="Consolas" w:hAnsi="Consolas"/>
+          <w:sz w:val="16"/>
+          <w:szCs w:val="16"/>
+          <w:highlight w:val="green"/>
+          <w:lang w:val="en-US"/>
+        </w:rPr>
+        <w:t>text_header.py</w:t>
+      </w:r>
+      <w:r>
+        <w:rPr>
+          <w:rFonts w:ascii="Consolas" w:hAnsi="Consolas"/>
+          <w:sz w:val="16"/>
+          <w:szCs w:val="16"/>
+          <w:lang w:val="en-US"/>
+        </w:rPr>
+        <w:t xml:space="preserve">           ← </w:t>
       </w:r>
       <w:proofErr w:type="spellStart"/>
       <w:r>
@@ -1644,7 +1809,49 @@
           <w:sz w:val="16"/>
           <w:szCs w:val="16"/>
         </w:rPr>
-        <w:t xml:space="preserve">│       │   │   ├── binary_fields.py         ← lista dos campos do </w:t>
+        <w:t xml:space="preserve">│       │   │   ├── </w:t>
+      </w:r>
+      <w:proofErr w:type="gramStart"/>
+      <w:r>
+        <w:rPr>
+          <w:rFonts w:ascii="Consolas" w:hAnsi="Consolas"/>
+          <w:sz w:val="16"/>
+          <w:szCs w:val="16"/>
+        </w:rPr>
+        <w:t>binary_</w:t>
+      </w:r>
+      <w:r>
+        <w:rPr>
+          <w:rFonts w:ascii="Consolas" w:hAnsi="Consolas"/>
+          <w:sz w:val="16"/>
+          <w:szCs w:val="16"/>
+        </w:rPr>
+        <w:t>he</w:t>
+      </w:r>
+      <w:r>
+        <w:rPr>
+          <w:rFonts w:ascii="Consolas" w:hAnsi="Consolas"/>
+          <w:sz w:val="16"/>
+          <w:szCs w:val="16"/>
+        </w:rPr>
+        <w:t>ader_</w:t>
+      </w:r>
+      <w:r>
+        <w:rPr>
+          <w:rFonts w:ascii="Consolas" w:hAnsi="Consolas"/>
+          <w:sz w:val="16"/>
+          <w:szCs w:val="16"/>
+        </w:rPr>
+        <w:t>fields.py  ←</w:t>
+      </w:r>
+      <w:proofErr w:type="gramEnd"/>
+      <w:r>
+        <w:rPr>
+          <w:rFonts w:ascii="Consolas" w:hAnsi="Consolas"/>
+          <w:sz w:val="16"/>
+          <w:szCs w:val="16"/>
+        </w:rPr>
+        <w:t xml:space="preserve"> lista dos campos do </w:t>
       </w:r>
       <w:proofErr w:type="spellStart"/>
       <w:r>
@@ -1690,15 +1897,13 @@
           <w:rFonts w:ascii="Consolas" w:hAnsi="Consolas"/>
           <w:sz w:val="16"/>
           <w:szCs w:val="16"/>
-          <w:lang w:val="en-US"/>
-        </w:rPr>
-      </w:pPr>
-      <w:r>
-        <w:rPr>
-          <w:rFonts w:ascii="Consolas" w:hAnsi="Consolas"/>
-          <w:sz w:val="16"/>
-          <w:szCs w:val="16"/>
-          <w:lang w:val="en-US"/>
+        </w:rPr>
+      </w:pPr>
+      <w:r>
+        <w:rPr>
+          <w:rFonts w:ascii="Consolas" w:hAnsi="Consolas"/>
+          <w:sz w:val="16"/>
+          <w:szCs w:val="16"/>
         </w:rPr>
         <w:t>│       │   │</w:t>
       </w:r>
@@ -1710,35 +1915,49 @@
           <w:rFonts w:ascii="Consolas" w:hAnsi="Consolas"/>
           <w:sz w:val="16"/>
           <w:szCs w:val="16"/>
-          <w:lang w:val="en-US"/>
-        </w:rPr>
-      </w:pPr>
-      <w:r>
-        <w:rPr>
-          <w:rFonts w:ascii="Consolas" w:hAnsi="Consolas"/>
-          <w:sz w:val="16"/>
-          <w:szCs w:val="16"/>
-          <w:lang w:val="en-US"/>
-        </w:rPr>
-        <w:t>│       │   ├── processing/</w:t>
-      </w:r>
-    </w:p>
-    <w:p>
-      <w:pPr>
-        <w:spacing w:after="0" w:line="240" w:lineRule="auto"/>
-        <w:rPr>
-          <w:rFonts w:ascii="Consolas" w:hAnsi="Consolas"/>
-          <w:sz w:val="16"/>
-          <w:szCs w:val="16"/>
-          <w:lang w:val="en-US"/>
-        </w:rPr>
-      </w:pPr>
-      <w:r>
-        <w:rPr>
-          <w:rFonts w:ascii="Consolas" w:hAnsi="Consolas"/>
-          <w:sz w:val="16"/>
-          <w:szCs w:val="16"/>
-          <w:lang w:val="en-US"/>
+        </w:rPr>
+      </w:pPr>
+      <w:r>
+        <w:rPr>
+          <w:rFonts w:ascii="Consolas" w:hAnsi="Consolas"/>
+          <w:sz w:val="16"/>
+          <w:szCs w:val="16"/>
+        </w:rPr>
+        <w:t xml:space="preserve">│       │   ├── </w:t>
+      </w:r>
+      <w:proofErr w:type="spellStart"/>
+      <w:r>
+        <w:rPr>
+          <w:rFonts w:ascii="Consolas" w:hAnsi="Consolas"/>
+          <w:sz w:val="16"/>
+          <w:szCs w:val="16"/>
+        </w:rPr>
+        <w:t>processing</w:t>
+      </w:r>
+      <w:proofErr w:type="spellEnd"/>
+      <w:r>
+        <w:rPr>
+          <w:rFonts w:ascii="Consolas" w:hAnsi="Consolas"/>
+          <w:sz w:val="16"/>
+          <w:szCs w:val="16"/>
+        </w:rPr>
+        <w:t>/</w:t>
+      </w:r>
+    </w:p>
+    <w:p>
+      <w:pPr>
+        <w:spacing w:after="0" w:line="240" w:lineRule="auto"/>
+        <w:rPr>
+          <w:rFonts w:ascii="Consolas" w:hAnsi="Consolas"/>
+          <w:sz w:val="16"/>
+          <w:szCs w:val="16"/>
+        </w:rPr>
+      </w:pPr>
+      <w:r>
+        <w:rPr>
+          <w:rFonts w:ascii="Consolas" w:hAnsi="Consolas"/>
+          <w:sz w:val="16"/>
+          <w:szCs w:val="16"/>
         </w:rPr>
         <w:t>│       │   │   ├── __init__.py</w:t>
       </w:r>
@@ -1750,15 +1969,13 @@
           <w:rFonts w:ascii="Consolas" w:hAnsi="Consolas"/>
           <w:sz w:val="16"/>
           <w:szCs w:val="16"/>
-          <w:lang w:val="en-US"/>
-        </w:rPr>
-      </w:pPr>
-      <w:r>
-        <w:rPr>
-          <w:rFonts w:ascii="Consolas" w:hAnsi="Consolas"/>
-          <w:sz w:val="16"/>
-          <w:szCs w:val="16"/>
-          <w:lang w:val="en-US"/>
+        </w:rPr>
+      </w:pPr>
+      <w:r>
+        <w:rPr>
+          <w:rFonts w:ascii="Consolas" w:hAnsi="Consolas"/>
+          <w:sz w:val="16"/>
+          <w:szCs w:val="16"/>
         </w:rPr>
         <w:t>│       │   │   ├── filters.py</w:t>
       </w:r>
@@ -1770,15 +1987,13 @@
           <w:rFonts w:ascii="Consolas" w:hAnsi="Consolas"/>
           <w:sz w:val="16"/>
           <w:szCs w:val="16"/>
-          <w:lang w:val="en-US"/>
-        </w:rPr>
-      </w:pPr>
-      <w:r>
-        <w:rPr>
-          <w:rFonts w:ascii="Consolas" w:hAnsi="Consolas"/>
-          <w:sz w:val="16"/>
-          <w:szCs w:val="16"/>
-          <w:lang w:val="en-US"/>
+        </w:rPr>
+      </w:pPr>
+      <w:r>
+        <w:rPr>
+          <w:rFonts w:ascii="Consolas" w:hAnsi="Consolas"/>
+          <w:sz w:val="16"/>
+          <w:szCs w:val="16"/>
         </w:rPr>
         <w:t>│       │   │   ├── gain.py</w:t>
       </w:r>
@@ -1790,15 +2005,13 @@
           <w:rFonts w:ascii="Consolas" w:hAnsi="Consolas"/>
           <w:sz w:val="16"/>
           <w:szCs w:val="16"/>
-          <w:lang w:val="en-US"/>
-        </w:rPr>
-      </w:pPr>
-      <w:r>
-        <w:rPr>
-          <w:rFonts w:ascii="Consolas" w:hAnsi="Consolas"/>
-          <w:sz w:val="16"/>
-          <w:szCs w:val="16"/>
-          <w:lang w:val="en-US"/>
+        </w:rPr>
+      </w:pPr>
+      <w:r>
+        <w:rPr>
+          <w:rFonts w:ascii="Consolas" w:hAnsi="Consolas"/>
+          <w:sz w:val="16"/>
+          <w:szCs w:val="16"/>
         </w:rPr>
         <w:t>│       │   │   ├── normalization.py</w:t>
       </w:r>
@@ -1810,15 +2023,13 @@
           <w:rFonts w:ascii="Consolas" w:hAnsi="Consolas"/>
           <w:sz w:val="16"/>
           <w:szCs w:val="16"/>
-          <w:lang w:val="en-US"/>
-        </w:rPr>
-      </w:pPr>
-      <w:r>
-        <w:rPr>
-          <w:rFonts w:ascii="Consolas" w:hAnsi="Consolas"/>
-          <w:sz w:val="16"/>
-          <w:szCs w:val="16"/>
-          <w:lang w:val="en-US"/>
+        </w:rPr>
+      </w:pPr>
+      <w:r>
+        <w:rPr>
+          <w:rFonts w:ascii="Consolas" w:hAnsi="Consolas"/>
+          <w:sz w:val="16"/>
+          <w:szCs w:val="16"/>
         </w:rPr>
         <w:t>│       │   │   └── processing_parameters.py</w:t>
       </w:r>
@@ -1830,15 +2041,13 @@
           <w:rFonts w:ascii="Consolas" w:hAnsi="Consolas"/>
           <w:sz w:val="16"/>
           <w:szCs w:val="16"/>
-          <w:lang w:val="en-US"/>
-        </w:rPr>
-      </w:pPr>
-      <w:r>
-        <w:rPr>
-          <w:rFonts w:ascii="Consolas" w:hAnsi="Consolas"/>
-          <w:sz w:val="16"/>
-          <w:szCs w:val="16"/>
-          <w:lang w:val="en-US"/>
+        </w:rPr>
+      </w:pPr>
+      <w:r>
+        <w:rPr>
+          <w:rFonts w:ascii="Consolas" w:hAnsi="Consolas"/>
+          <w:sz w:val="16"/>
+          <w:szCs w:val="16"/>
         </w:rPr>
         <w:t>│       │   │</w:t>
       </w:r>
@@ -2240,6 +2449,7 @@
           <w:szCs w:val="16"/>
           <w:lang w:val="en-US"/>
         </w:rPr>
+        <w:lastRenderedPageBreak/>
         <w:t>│       │   ├── services/</w:t>
       </w:r>
     </w:p>
@@ -2260,7 +2470,6 @@
           <w:szCs w:val="16"/>
           <w:lang w:val="en-US"/>
         </w:rPr>
-        <w:lastRenderedPageBreak/>
         <w:t>│       │   │   ├── __init__.py</w:t>
       </w:r>
     </w:p>
@@ -2517,6 +2726,7 @@
       <w:r>
         <w:rPr>
           <w:rFonts w:ascii="Consolas" w:hAnsi="Consolas"/>
+          <w:noProof/>
           <w:sz w:val="16"/>
           <w:szCs w:val="16"/>
           <w:lang w:val="en-US"/>
@@ -2545,7 +2755,7 @@
                     <pic:cNvPicPr/>
                   </pic:nvPicPr>
                   <pic:blipFill>
-                    <a:blip r:embed="rId7">
+                    <a:blip r:embed="rId8">
                       <a:extLst>
                         <a:ext uri="{28A0092B-C50C-407E-A947-70E740481C1C}">
                           <a14:useLocalDpi xmlns:a14="http://schemas.microsoft.com/office/drawing/2010/main" val="0"/>
@@ -2896,15 +3106,7 @@
           <w:sz w:val="16"/>
           <w:szCs w:val="16"/>
         </w:rPr>
-        <w:t xml:space="preserve">    </w:t>
-      </w:r>
-      <w:r>
-        <w:rPr>
-          <w:rFonts w:ascii="Consolas" w:hAnsi="Consolas"/>
-          <w:sz w:val="16"/>
-          <w:szCs w:val="16"/>
-        </w:rPr>
-        <w:t># Classe auxiliar de baixo nível</w:t>
+        <w:t xml:space="preserve">    # Classe auxiliar de baixo nível</w:t>
       </w:r>
     </w:p>
     <w:p>
@@ -2940,6 +3142,7 @@
       <w:r>
         <w:rPr>
           <w:rFonts w:ascii="Consolas" w:hAnsi="Consolas"/>
+          <w:noProof/>
           <w:sz w:val="16"/>
           <w:szCs w:val="16"/>
           <w:lang w:val="en-US"/>
@@ -2968,7 +3171,7 @@
                     <pic:cNvPicPr/>
                   </pic:nvPicPr>
                   <pic:blipFill>
-                    <a:blip r:embed="rId8">
+                    <a:blip r:embed="rId9">
                       <a:extLst>
                         <a:ext uri="{28A0092B-C50C-407E-A947-70E740481C1C}">
                           <a14:useLocalDpi xmlns:a14="http://schemas.microsoft.com/office/drawing/2010/main" val="0"/>
@@ -4233,6 +4436,7 @@
           <w:szCs w:val="16"/>
           <w:lang w:val="en-US"/>
         </w:rPr>
+        <w:lastRenderedPageBreak/>
         <w:t>│       │   │   └── models/</w:t>
       </w:r>
     </w:p>
@@ -4253,7 +4457,6 @@
           <w:szCs w:val="16"/>
           <w:lang w:val="en-US"/>
         </w:rPr>
-        <w:lastRenderedPageBreak/>
         <w:t>│       │   │       ├── __init__.py</w:t>
       </w:r>
     </w:p>
@@ -5402,7 +5605,7 @@
                     <pic:cNvPicPr/>
                   </pic:nvPicPr>
                   <pic:blipFill>
-                    <a:blip r:embed="rId9"/>
+                    <a:blip r:embed="rId10"/>
                     <a:stretch>
                       <a:fillRect/>
                     </a:stretch>
@@ -5445,7 +5648,7 @@
                     <pic:cNvPicPr/>
                   </pic:nvPicPr>
                   <pic:blipFill>
-                    <a:blip r:embed="rId10"/>
+                    <a:blip r:embed="rId11"/>
                     <a:stretch>
                       <a:fillRect/>
                     </a:stretch>
@@ -6130,6 +6333,7 @@
   <w:style w:type="character" w:default="1" w:styleId="Fontepargpadro">
     <w:name w:val="Default Paragraph Font"/>
     <w:uiPriority w:val="1"/>
+    <w:semiHidden/>
     <w:unhideWhenUsed/>
   </w:style>
   <w:style w:type="table" w:default="1" w:styleId="Tabelanormal">

</xml_diff>

<commit_message>
Finalização da Classe TraceHeader e das classe que ela precisa, e tambem da classe SeismicTrace e das classes que ela precisa, inicio da implementacao dos metodos para a leitura dos tracos no SegyioReader
</commit_message>
<xml_diff>
--- a/docs/architecture/Estrutura de pastas do SEGY-PROJECT.docx
+++ b/docs/architecture/Estrutura de pastas do SEGY-PROJECT.docx
@@ -1801,13 +1801,15 @@
           <w:rFonts w:ascii="Consolas" w:hAnsi="Consolas"/>
           <w:sz w:val="16"/>
           <w:szCs w:val="16"/>
-        </w:rPr>
-      </w:pPr>
-      <w:r>
-        <w:rPr>
-          <w:rFonts w:ascii="Consolas" w:hAnsi="Consolas"/>
-          <w:sz w:val="16"/>
-          <w:szCs w:val="16"/>
+          <w:lang w:val="en-US"/>
+        </w:rPr>
+      </w:pPr>
+      <w:r>
+        <w:rPr>
+          <w:rFonts w:ascii="Consolas" w:hAnsi="Consolas"/>
+          <w:sz w:val="16"/>
+          <w:szCs w:val="16"/>
+          <w:lang w:val="en-US"/>
         </w:rPr>
         <w:t xml:space="preserve">│       │   │   ├── </w:t>
       </w:r>
@@ -1817,6 +1819,7 @@
           <w:rFonts w:ascii="Consolas" w:hAnsi="Consolas"/>
           <w:sz w:val="16"/>
           <w:szCs w:val="16"/>
+          <w:lang w:val="en-US"/>
         </w:rPr>
         <w:t>binary_</w:t>
       </w:r>
@@ -1825,22 +1828,16 @@
           <w:rFonts w:ascii="Consolas" w:hAnsi="Consolas"/>
           <w:sz w:val="16"/>
           <w:szCs w:val="16"/>
-        </w:rPr>
-        <w:t>he</w:t>
-      </w:r>
-      <w:r>
-        <w:rPr>
-          <w:rFonts w:ascii="Consolas" w:hAnsi="Consolas"/>
-          <w:sz w:val="16"/>
-          <w:szCs w:val="16"/>
-        </w:rPr>
-        <w:t>ader_</w:t>
-      </w:r>
-      <w:r>
-        <w:rPr>
-          <w:rFonts w:ascii="Consolas" w:hAnsi="Consolas"/>
-          <w:sz w:val="16"/>
-          <w:szCs w:val="16"/>
+          <w:lang w:val="en-US"/>
+        </w:rPr>
+        <w:t>header_</w:t>
+      </w:r>
+      <w:r>
+        <w:rPr>
+          <w:rFonts w:ascii="Consolas" w:hAnsi="Consolas"/>
+          <w:sz w:val="16"/>
+          <w:szCs w:val="16"/>
+          <w:lang w:val="en-US"/>
         </w:rPr>
         <w:t>fields.py  ←</w:t>
       </w:r>
@@ -1850,8 +1847,9 @@
           <w:rFonts w:ascii="Consolas" w:hAnsi="Consolas"/>
           <w:sz w:val="16"/>
           <w:szCs w:val="16"/>
-        </w:rPr>
-        <w:t xml:space="preserve"> lista dos campos do </w:t>
+          <w:lang w:val="en-US"/>
+        </w:rPr>
+        <w:t xml:space="preserve"> </w:t>
       </w:r>
       <w:proofErr w:type="spellStart"/>
       <w:r>
@@ -1859,8 +1857,9 @@
           <w:rFonts w:ascii="Consolas" w:hAnsi="Consolas"/>
           <w:sz w:val="16"/>
           <w:szCs w:val="16"/>
-        </w:rPr>
-        <w:t>Binary</w:t>
+          <w:lang w:val="en-US"/>
+        </w:rPr>
+        <w:t>lista</w:t>
       </w:r>
       <w:proofErr w:type="spellEnd"/>
       <w:r>
@@ -1868,42 +1867,67 @@
           <w:rFonts w:ascii="Consolas" w:hAnsi="Consolas"/>
           <w:sz w:val="16"/>
           <w:szCs w:val="16"/>
-        </w:rPr>
-        <w:t xml:space="preserve"> Header</w:t>
-      </w:r>
-    </w:p>
-    <w:p>
-      <w:pPr>
-        <w:spacing w:after="0" w:line="240" w:lineRule="auto"/>
-        <w:rPr>
-          <w:rFonts w:ascii="Consolas" w:hAnsi="Consolas"/>
-          <w:sz w:val="16"/>
-          <w:szCs w:val="16"/>
-        </w:rPr>
-      </w:pPr>
-      <w:r>
-        <w:rPr>
-          <w:rFonts w:ascii="Consolas" w:hAnsi="Consolas"/>
-          <w:sz w:val="16"/>
-          <w:szCs w:val="16"/>
-        </w:rPr>
-        <w:t>│       │   │   └── trace_fields.py          ← lista dos campos do Trace Header</w:t>
-      </w:r>
-    </w:p>
-    <w:p>
-      <w:pPr>
-        <w:spacing w:after="0" w:line="240" w:lineRule="auto"/>
-        <w:rPr>
-          <w:rFonts w:ascii="Consolas" w:hAnsi="Consolas"/>
-          <w:sz w:val="16"/>
-          <w:szCs w:val="16"/>
-        </w:rPr>
-      </w:pPr>
-      <w:r>
-        <w:rPr>
-          <w:rFonts w:ascii="Consolas" w:hAnsi="Consolas"/>
-          <w:sz w:val="16"/>
-          <w:szCs w:val="16"/>
+          <w:lang w:val="en-US"/>
+        </w:rPr>
+        <w:t xml:space="preserve"> dos campos do Binary Header</w:t>
+      </w:r>
+    </w:p>
+    <w:p>
+      <w:pPr>
+        <w:spacing w:after="0" w:line="240" w:lineRule="auto"/>
+        <w:rPr>
+          <w:rFonts w:ascii="Consolas" w:hAnsi="Consolas"/>
+          <w:sz w:val="16"/>
+          <w:szCs w:val="16"/>
+          <w:lang w:val="en-US"/>
+        </w:rPr>
+      </w:pPr>
+      <w:r>
+        <w:rPr>
+          <w:rFonts w:ascii="Consolas" w:hAnsi="Consolas"/>
+          <w:sz w:val="16"/>
+          <w:szCs w:val="16"/>
+          <w:lang w:val="en-US"/>
+        </w:rPr>
+        <w:t xml:space="preserve">│       │   │   └── trace_fields.py          ← </w:t>
+      </w:r>
+      <w:proofErr w:type="spellStart"/>
+      <w:r>
+        <w:rPr>
+          <w:rFonts w:ascii="Consolas" w:hAnsi="Consolas"/>
+          <w:sz w:val="16"/>
+          <w:szCs w:val="16"/>
+          <w:lang w:val="en-US"/>
+        </w:rPr>
+        <w:t>lista</w:t>
+      </w:r>
+      <w:proofErr w:type="spellEnd"/>
+      <w:r>
+        <w:rPr>
+          <w:rFonts w:ascii="Consolas" w:hAnsi="Consolas"/>
+          <w:sz w:val="16"/>
+          <w:szCs w:val="16"/>
+          <w:lang w:val="en-US"/>
+        </w:rPr>
+        <w:t xml:space="preserve"> dos campos do Trace Header</w:t>
+      </w:r>
+    </w:p>
+    <w:p>
+      <w:pPr>
+        <w:spacing w:after="0" w:line="240" w:lineRule="auto"/>
+        <w:rPr>
+          <w:rFonts w:ascii="Consolas" w:hAnsi="Consolas"/>
+          <w:sz w:val="16"/>
+          <w:szCs w:val="16"/>
+          <w:lang w:val="en-US"/>
+        </w:rPr>
+      </w:pPr>
+      <w:r>
+        <w:rPr>
+          <w:rFonts w:ascii="Consolas" w:hAnsi="Consolas"/>
+          <w:sz w:val="16"/>
+          <w:szCs w:val="16"/>
+          <w:lang w:val="en-US"/>
         </w:rPr>
         <w:t>│       │   │</w:t>
       </w:r>
@@ -1915,49 +1939,35 @@
           <w:rFonts w:ascii="Consolas" w:hAnsi="Consolas"/>
           <w:sz w:val="16"/>
           <w:szCs w:val="16"/>
-        </w:rPr>
-      </w:pPr>
-      <w:r>
-        <w:rPr>
-          <w:rFonts w:ascii="Consolas" w:hAnsi="Consolas"/>
-          <w:sz w:val="16"/>
-          <w:szCs w:val="16"/>
-        </w:rPr>
-        <w:t xml:space="preserve">│       │   ├── </w:t>
-      </w:r>
-      <w:proofErr w:type="spellStart"/>
-      <w:r>
-        <w:rPr>
-          <w:rFonts w:ascii="Consolas" w:hAnsi="Consolas"/>
-          <w:sz w:val="16"/>
-          <w:szCs w:val="16"/>
-        </w:rPr>
-        <w:t>processing</w:t>
-      </w:r>
-      <w:proofErr w:type="spellEnd"/>
-      <w:r>
-        <w:rPr>
-          <w:rFonts w:ascii="Consolas" w:hAnsi="Consolas"/>
-          <w:sz w:val="16"/>
-          <w:szCs w:val="16"/>
-        </w:rPr>
-        <w:t>/</w:t>
-      </w:r>
-    </w:p>
-    <w:p>
-      <w:pPr>
-        <w:spacing w:after="0" w:line="240" w:lineRule="auto"/>
-        <w:rPr>
-          <w:rFonts w:ascii="Consolas" w:hAnsi="Consolas"/>
-          <w:sz w:val="16"/>
-          <w:szCs w:val="16"/>
-        </w:rPr>
-      </w:pPr>
-      <w:r>
-        <w:rPr>
-          <w:rFonts w:ascii="Consolas" w:hAnsi="Consolas"/>
-          <w:sz w:val="16"/>
-          <w:szCs w:val="16"/>
+          <w:lang w:val="en-US"/>
+        </w:rPr>
+      </w:pPr>
+      <w:r>
+        <w:rPr>
+          <w:rFonts w:ascii="Consolas" w:hAnsi="Consolas"/>
+          <w:sz w:val="16"/>
+          <w:szCs w:val="16"/>
+          <w:lang w:val="en-US"/>
+        </w:rPr>
+        <w:t>│       │   ├── processing/</w:t>
+      </w:r>
+    </w:p>
+    <w:p>
+      <w:pPr>
+        <w:spacing w:after="0" w:line="240" w:lineRule="auto"/>
+        <w:rPr>
+          <w:rFonts w:ascii="Consolas" w:hAnsi="Consolas"/>
+          <w:sz w:val="16"/>
+          <w:szCs w:val="16"/>
+          <w:lang w:val="en-US"/>
+        </w:rPr>
+      </w:pPr>
+      <w:r>
+        <w:rPr>
+          <w:rFonts w:ascii="Consolas" w:hAnsi="Consolas"/>
+          <w:sz w:val="16"/>
+          <w:szCs w:val="16"/>
+          <w:lang w:val="en-US"/>
         </w:rPr>
         <w:t>│       │   │   ├── __init__.py</w:t>
       </w:r>
@@ -1969,13 +1979,15 @@
           <w:rFonts w:ascii="Consolas" w:hAnsi="Consolas"/>
           <w:sz w:val="16"/>
           <w:szCs w:val="16"/>
-        </w:rPr>
-      </w:pPr>
-      <w:r>
-        <w:rPr>
-          <w:rFonts w:ascii="Consolas" w:hAnsi="Consolas"/>
-          <w:sz w:val="16"/>
-          <w:szCs w:val="16"/>
+          <w:lang w:val="en-US"/>
+        </w:rPr>
+      </w:pPr>
+      <w:r>
+        <w:rPr>
+          <w:rFonts w:ascii="Consolas" w:hAnsi="Consolas"/>
+          <w:sz w:val="16"/>
+          <w:szCs w:val="16"/>
+          <w:lang w:val="en-US"/>
         </w:rPr>
         <w:t>│       │   │   ├── filters.py</w:t>
       </w:r>
@@ -1987,13 +1999,15 @@
           <w:rFonts w:ascii="Consolas" w:hAnsi="Consolas"/>
           <w:sz w:val="16"/>
           <w:szCs w:val="16"/>
-        </w:rPr>
-      </w:pPr>
-      <w:r>
-        <w:rPr>
-          <w:rFonts w:ascii="Consolas" w:hAnsi="Consolas"/>
-          <w:sz w:val="16"/>
-          <w:szCs w:val="16"/>
+          <w:lang w:val="en-US"/>
+        </w:rPr>
+      </w:pPr>
+      <w:r>
+        <w:rPr>
+          <w:rFonts w:ascii="Consolas" w:hAnsi="Consolas"/>
+          <w:sz w:val="16"/>
+          <w:szCs w:val="16"/>
+          <w:lang w:val="en-US"/>
         </w:rPr>
         <w:t>│       │   │   ├── gain.py</w:t>
       </w:r>
@@ -2005,13 +2019,15 @@
           <w:rFonts w:ascii="Consolas" w:hAnsi="Consolas"/>
           <w:sz w:val="16"/>
           <w:szCs w:val="16"/>
-        </w:rPr>
-      </w:pPr>
-      <w:r>
-        <w:rPr>
-          <w:rFonts w:ascii="Consolas" w:hAnsi="Consolas"/>
-          <w:sz w:val="16"/>
-          <w:szCs w:val="16"/>
+          <w:lang w:val="en-US"/>
+        </w:rPr>
+      </w:pPr>
+      <w:r>
+        <w:rPr>
+          <w:rFonts w:ascii="Consolas" w:hAnsi="Consolas"/>
+          <w:sz w:val="16"/>
+          <w:szCs w:val="16"/>
+          <w:lang w:val="en-US"/>
         </w:rPr>
         <w:t>│       │   │   ├── normalization.py</w:t>
       </w:r>
@@ -2023,13 +2039,15 @@
           <w:rFonts w:ascii="Consolas" w:hAnsi="Consolas"/>
           <w:sz w:val="16"/>
           <w:szCs w:val="16"/>
-        </w:rPr>
-      </w:pPr>
-      <w:r>
-        <w:rPr>
-          <w:rFonts w:ascii="Consolas" w:hAnsi="Consolas"/>
-          <w:sz w:val="16"/>
-          <w:szCs w:val="16"/>
+          <w:lang w:val="en-US"/>
+        </w:rPr>
+      </w:pPr>
+      <w:r>
+        <w:rPr>
+          <w:rFonts w:ascii="Consolas" w:hAnsi="Consolas"/>
+          <w:sz w:val="16"/>
+          <w:szCs w:val="16"/>
+          <w:lang w:val="en-US"/>
         </w:rPr>
         <w:t>│       │   │   └── processing_parameters.py</w:t>
       </w:r>
@@ -2041,13 +2059,15 @@
           <w:rFonts w:ascii="Consolas" w:hAnsi="Consolas"/>
           <w:sz w:val="16"/>
           <w:szCs w:val="16"/>
-        </w:rPr>
-      </w:pPr>
-      <w:r>
-        <w:rPr>
-          <w:rFonts w:ascii="Consolas" w:hAnsi="Consolas"/>
-          <w:sz w:val="16"/>
-          <w:szCs w:val="16"/>
+          <w:lang w:val="en-US"/>
+        </w:rPr>
+      </w:pPr>
+      <w:r>
+        <w:rPr>
+          <w:rFonts w:ascii="Consolas" w:hAnsi="Consolas"/>
+          <w:sz w:val="16"/>
+          <w:szCs w:val="16"/>
+          <w:lang w:val="en-US"/>
         </w:rPr>
         <w:t>│       │   │</w:t>
       </w:r>
@@ -3576,6 +3596,69 @@
           <w:szCs w:val="16"/>
           <w:lang w:val="en-US"/>
         </w:rPr>
+        <w:drawing>
+          <wp:anchor distT="0" distB="0" distL="114300" distR="114300" simplePos="0" relativeHeight="251663360" behindDoc="0" locked="0" layoutInCell="1" allowOverlap="1" wp14:anchorId="2D9BC36C" wp14:editId="5CA16F00">
+            <wp:simplePos x="0" y="0"/>
+            <wp:positionH relativeFrom="margin">
+              <wp:posOffset>2782939</wp:posOffset>
+            </wp:positionH>
+            <wp:positionV relativeFrom="paragraph">
+              <wp:posOffset>50490</wp:posOffset>
+            </wp:positionV>
+            <wp:extent cx="4177142" cy="2412956"/>
+            <wp:effectExtent l="0" t="0" r="0" b="6985"/>
+            <wp:wrapNone/>
+            <wp:docPr id="1593638214" name="Imagem 1"/>
+            <wp:cNvGraphicFramePr>
+              <a:graphicFrameLocks xmlns:a="http://schemas.openxmlformats.org/drawingml/2006/main" noChangeAspect="1"/>
+            </wp:cNvGraphicFramePr>
+            <a:graphic xmlns:a="http://schemas.openxmlformats.org/drawingml/2006/main">
+              <a:graphicData uri="http://schemas.openxmlformats.org/drawingml/2006/picture">
+                <pic:pic xmlns:pic="http://schemas.openxmlformats.org/drawingml/2006/picture">
+                  <pic:nvPicPr>
+                    <pic:cNvPr id="1593638214" name=""/>
+                    <pic:cNvPicPr/>
+                  </pic:nvPicPr>
+                  <pic:blipFill>
+                    <a:blip r:embed="rId10">
+                      <a:extLst>
+                        <a:ext uri="{28A0092B-C50C-407E-A947-70E740481C1C}">
+                          <a14:useLocalDpi xmlns:a14="http://schemas.microsoft.com/office/drawing/2010/main" val="0"/>
+                        </a:ext>
+                      </a:extLst>
+                    </a:blip>
+                    <a:stretch>
+                      <a:fillRect/>
+                    </a:stretch>
+                  </pic:blipFill>
+                  <pic:spPr>
+                    <a:xfrm>
+                      <a:off x="0" y="0"/>
+                      <a:ext cx="4194736" cy="2423119"/>
+                    </a:xfrm>
+                    <a:prstGeom prst="rect">
+                      <a:avLst/>
+                    </a:prstGeom>
+                  </pic:spPr>
+                </pic:pic>
+              </a:graphicData>
+            </a:graphic>
+            <wp14:sizeRelH relativeFrom="page">
+              <wp14:pctWidth>0</wp14:pctWidth>
+            </wp14:sizeRelH>
+            <wp14:sizeRelV relativeFrom="page">
+              <wp14:pctHeight>0</wp14:pctHeight>
+            </wp14:sizeRelV>
+          </wp:anchor>
+        </w:drawing>
+      </w:r>
+      <w:r>
+        <w:rPr>
+          <w:rFonts w:ascii="Consolas" w:hAnsi="Consolas"/>
+          <w:sz w:val="16"/>
+          <w:szCs w:val="16"/>
+          <w:lang w:val="en-US"/>
+        </w:rPr>
         <w:t>│       │</w:t>
       </w:r>
     </w:p>
@@ -5581,6 +5664,78 @@
           <w:szCs w:val="16"/>
         </w:rPr>
         <w:t xml:space="preserve">    └── conftest.py</w:t>
+      </w:r>
+    </w:p>
+    <w:p>
+      <w:pPr>
+        <w:spacing w:after="0" w:line="240" w:lineRule="auto"/>
+        <w:rPr>
+          <w:rFonts w:ascii="Consolas" w:hAnsi="Consolas"/>
+          <w:sz w:val="16"/>
+          <w:szCs w:val="16"/>
+        </w:rPr>
+      </w:pPr>
+      <w:r>
+        <w:rPr>
+          <w:rFonts w:ascii="Consolas" w:hAnsi="Consolas"/>
+          <w:sz w:val="16"/>
+          <w:szCs w:val="16"/>
+        </w:rPr>
+        <w:drawing>
+          <wp:anchor distT="0" distB="0" distL="114300" distR="114300" simplePos="0" relativeHeight="251662336" behindDoc="0" locked="0" layoutInCell="1" allowOverlap="1" wp14:anchorId="17AE6CB1" wp14:editId="31CAC5AA">
+            <wp:simplePos x="0" y="0"/>
+            <wp:positionH relativeFrom="column">
+              <wp:posOffset>30406</wp:posOffset>
+            </wp:positionH>
+            <wp:positionV relativeFrom="paragraph">
+              <wp:posOffset>82713</wp:posOffset>
+            </wp:positionV>
+            <wp:extent cx="2610214" cy="1219370"/>
+            <wp:effectExtent l="0" t="0" r="0" b="0"/>
+            <wp:wrapNone/>
+            <wp:docPr id="1797970787" name="Imagem 1"/>
+            <wp:cNvGraphicFramePr>
+              <a:graphicFrameLocks xmlns:a="http://schemas.openxmlformats.org/drawingml/2006/main" noChangeAspect="1"/>
+            </wp:cNvGraphicFramePr>
+            <a:graphic xmlns:a="http://schemas.openxmlformats.org/drawingml/2006/main">
+              <a:graphicData uri="http://schemas.openxmlformats.org/drawingml/2006/picture">
+                <pic:pic xmlns:pic="http://schemas.openxmlformats.org/drawingml/2006/picture">
+                  <pic:nvPicPr>
+                    <pic:cNvPr id="1797970787" name=""/>
+                    <pic:cNvPicPr/>
+                  </pic:nvPicPr>
+                  <pic:blipFill>
+                    <a:blip r:embed="rId11">
+                      <a:extLst>
+                        <a:ext uri="{28A0092B-C50C-407E-A947-70E740481C1C}">
+                          <a14:useLocalDpi xmlns:a14="http://schemas.microsoft.com/office/drawing/2010/main" val="0"/>
+                        </a:ext>
+                      </a:extLst>
+                    </a:blip>
+                    <a:stretch>
+                      <a:fillRect/>
+                    </a:stretch>
+                  </pic:blipFill>
+                  <pic:spPr>
+                    <a:xfrm>
+                      <a:off x="0" y="0"/>
+                      <a:ext cx="2610214" cy="1219370"/>
+                    </a:xfrm>
+                    <a:prstGeom prst="rect">
+                      <a:avLst/>
+                    </a:prstGeom>
+                  </pic:spPr>
+                </pic:pic>
+              </a:graphicData>
+            </a:graphic>
+            <wp14:sizeRelH relativeFrom="page">
+              <wp14:pctWidth>0</wp14:pctWidth>
+            </wp14:sizeRelH>
+            <wp14:sizeRelV relativeFrom="page">
+              <wp14:pctHeight>0</wp14:pctHeight>
+            </wp14:sizeRelV>
+          </wp:anchor>
+        </w:drawing>
       </w:r>
     </w:p>
     <w:p>
@@ -5605,7 +5760,7 @@
                     <pic:cNvPicPr/>
                   </pic:nvPicPr>
                   <pic:blipFill>
-                    <a:blip r:embed="rId10"/>
+                    <a:blip r:embed="rId12"/>
                     <a:stretch>
                       <a:fillRect/>
                     </a:stretch>
@@ -5648,7 +5803,7 @@
                     <pic:cNvPicPr/>
                   </pic:nvPicPr>
                   <pic:blipFill>
-                    <a:blip r:embed="rId11"/>
+                    <a:blip r:embed="rId13"/>
                     <a:stretch>
                       <a:fillRect/>
                     </a:stretch>

</xml_diff>